<commit_message>
fix(template): usunięcie słowa "sporządzone" w dwóch miejscach wzoru wezwania
Co-Authored-By: Claude Opus 5 (1M context) <noreply@anthropic.com>
</commit_message>
<xml_diff>
--- a/demand_generator/templates/wezwanie_template.docx
+++ b/demand_generator/templates/wezwanie_template.docx
@@ -718,7 +718,7 @@
           <w:sz w:val="24"/>
           <w:szCs w:val="24"/>
         </w:rPr>
-        <w:t xml:space="preserve">wyliczone na dzień sporządzenia wezwania </w:t>
+        <w:t xml:space="preserve">wyliczone na dzień wezwania </w:t>
       </w:r>
       <w:r>
         <w:rPr>
@@ -784,7 +784,7 @@
           <w:sz w:val="24"/>
           <w:szCs w:val="24"/>
         </w:rPr>
-        <w:t xml:space="preserve">od rekompensaty za koszty odzyskiwania należności wyliczone na dzień sporządzenia wezwania </w:t>
+        <w:t xml:space="preserve">od rekompensaty za koszty odzyskiwania należności wyliczone na dzień wezwania </w:t>
       </w:r>
       <w:r>
         <w:rPr>

</xml_diff>